<commit_message>
feat: add completed version of weekly reflection and evaluation document
</commit_message>
<xml_diff>
--- a/John OyetolaFMP_P7_YR2 Weekly Reflection and Evaluation.docx
+++ b/John OyetolaFMP_P7_YR2 Weekly Reflection and Evaluation.docx
@@ -966,94 +966,108 @@
             <w:shd w:val="clear" w:color="auto" w:fill="ECECEC"/>
           </w:tcPr>
           <w:p>
-            <w:pPr>
-              <w:rPr>
-                <w:rFonts w:ascii="Segoe UI" w:hAnsi="Segoe UI" w:cs="Segoe UI"/>
-                <w:sz w:val="20"/>
-                <w:szCs w:val="20"/>
-              </w:rPr>
-            </w:pPr>
-            <w:r>
-              <w:rPr>
-                <w:rFonts w:ascii="Segoe UI" w:hAnsi="Segoe UI" w:cs="Segoe UI"/>
-                <w:sz w:val="20"/>
-                <w:szCs w:val="20"/>
-              </w:rPr>
-              <w:t xml:space="preserve">This week </w:t>
-            </w:r>
-            <w:r>
-              <w:rPr>
-                <w:rFonts w:ascii="Segoe UI" w:hAnsi="Segoe UI" w:cs="Segoe UI"/>
-                <w:sz w:val="20"/>
-                <w:szCs w:val="20"/>
-              </w:rPr>
-              <w:t xml:space="preserve">I spent </w:t>
-            </w:r>
             <w:r>
               <w:rPr>
                 <w:rFonts w:ascii="Segoe UI" w:eastAsia="Segoe UI" w:hAnsi="Segoe UI" w:cs="Segoe UI"/>
-                <w:sz w:val="20"/>
-                <w:szCs w:val="20"/>
-              </w:rPr>
-              <w:t>all</w:t>
+                <w:sz w:val="22"/>
+                <w:szCs w:val="22"/>
+              </w:rPr>
+              <w:t xml:space="preserve">This week was all about getting myself set up and understanding exactly what the Final Major Project involves. I spent a good amount of time going through the client brief for Hey Service Group </w:t>
             </w:r>
             <w:r>
               <w:rPr>
                 <w:rFonts w:ascii="Segoe UI" w:eastAsia="Segoe UI" w:hAnsi="Segoe UI" w:cs="Segoe UI"/>
-                <w:sz w:val="20"/>
-                <w:szCs w:val="20"/>
-              </w:rPr>
-              <w:t xml:space="preserve"> my time</w:t>
+                <w:sz w:val="22"/>
+                <w:szCs w:val="22"/>
+              </w:rPr>
+              <w:t>properly,</w:t>
             </w:r>
             <w:r>
               <w:rPr>
                 <w:rFonts w:ascii="Segoe UI" w:eastAsia="Segoe UI" w:hAnsi="Segoe UI" w:cs="Segoe UI"/>
-                <w:sz w:val="20"/>
-                <w:szCs w:val="20"/>
-              </w:rPr>
-              <w:t xml:space="preserve"> getting my head around the Final Major Project (FMP) and making sure I'm set up to deliver something professional for Hey Service Group. I spent a lot of time organizing my workflow because I know that "detailed and self-directed planning" is what’s going to get me that Distinction. I decided to use Trello to map out the next 12 weeks, numbering every task card from 1 to 12 so I don't lose track of the May 23rd deadline. I also got my Figma board ready and set up my project folders on Teams. Using these tools isn't just about being organized; it’s about proving I can manage a project like a pro, which is a massive part of the grading criteria for "Planning and Production". I felt </w:t>
+                <w:sz w:val="22"/>
+                <w:szCs w:val="22"/>
+              </w:rPr>
+              <w:t xml:space="preserve"> so I knew what I was </w:t>
             </w:r>
             <w:proofErr w:type="gramStart"/>
             <w:r>
               <w:rPr>
                 <w:rFonts w:ascii="Segoe UI" w:eastAsia="Segoe UI" w:hAnsi="Segoe UI" w:cs="Segoe UI"/>
-                <w:sz w:val="20"/>
-                <w:szCs w:val="20"/>
-              </w:rPr>
-              <w:t>pretty motivated</w:t>
+                <w:sz w:val="22"/>
+                <w:szCs w:val="22"/>
+              </w:rPr>
+              <w:t>actually building</w:t>
             </w:r>
             <w:proofErr w:type="gramEnd"/>
             <w:r>
               <w:rPr>
                 <w:rFonts w:ascii="Segoe UI" w:eastAsia="Segoe UI" w:hAnsi="Segoe UI" w:cs="Segoe UI"/>
-                <w:sz w:val="20"/>
-                <w:szCs w:val="20"/>
-              </w:rPr>
-              <w:t xml:space="preserve"> starting out, </w:t>
-            </w:r>
+                <w:sz w:val="22"/>
+                <w:szCs w:val="22"/>
+              </w:rPr>
+              <w:t xml:space="preserve"> before I jumped into anything.</w:t>
+            </w:r>
+          </w:p>
+          <w:p/>
+          <w:p>
             <w:r>
               <w:rPr>
                 <w:rFonts w:ascii="Segoe UI" w:eastAsia="Segoe UI" w:hAnsi="Segoe UI" w:cs="Segoe UI"/>
-                <w:sz w:val="20"/>
-                <w:szCs w:val="20"/>
-              </w:rPr>
-              <w:t xml:space="preserve">the difficulty with the website developing, the intricacy of the project and all the </w:t>
-            </w:r>
+                <w:sz w:val="22"/>
+                <w:szCs w:val="22"/>
+              </w:rPr>
+              <w:t>I set up my Trello board straight away and mapped out the 12 weeks so I had a clear plan and wouldn't lose track of the May 22nd deadline. I also got my Figma board ready and organised my project folders on Teams so everything was in the right place from the start.</w:t>
+            </w:r>
+          </w:p>
+          <w:p/>
+          <w:p>
+            <w:pPr>
+              <w:rPr>
+                <w:rFonts w:ascii="Segoe UI" w:hAnsi="Segoe UI" w:cs="Segoe UI"/>
+                <w:sz w:val="20"/>
+                <w:szCs w:val="20"/>
+              </w:rPr>
+            </w:pPr>
             <w:r>
               <w:rPr>
                 <w:rFonts w:ascii="Segoe UI" w:eastAsia="Segoe UI" w:hAnsi="Segoe UI" w:cs="Segoe UI"/>
-                <w:sz w:val="20"/>
-                <w:szCs w:val="20"/>
-              </w:rPr>
-              <w:t>requirements</w:t>
+                <w:sz w:val="22"/>
+                <w:szCs w:val="22"/>
+              </w:rPr>
+              <w:t xml:space="preserve">If I'm honest, I felt </w:t>
             </w:r>
             <w:r>
               <w:rPr>
                 <w:rFonts w:ascii="Segoe UI" w:eastAsia="Segoe UI" w:hAnsi="Segoe UI" w:cs="Segoe UI"/>
-                <w:sz w:val="20"/>
-                <w:szCs w:val="20"/>
-              </w:rPr>
-              <w:t xml:space="preserve">. </w:t>
+                <w:sz w:val="22"/>
+                <w:szCs w:val="22"/>
+              </w:rPr>
+              <w:t>motivated</w:t>
+            </w:r>
+            <w:r>
+              <w:rPr>
+                <w:rFonts w:ascii="Segoe UI" w:eastAsia="Segoe UI" w:hAnsi="Segoe UI" w:cs="Segoe UI"/>
+                <w:sz w:val="22"/>
+                <w:szCs w:val="22"/>
+              </w:rPr>
+              <w:t xml:space="preserve"> at the start of this week. The project is clearly a big one with a lot of requirements but having a plan laid out helped me feel more in control. The main thing I took from this week is that staying organised from day one is </w:t>
+            </w:r>
+            <w:r>
+              <w:rPr>
+                <w:rFonts w:ascii="Segoe UI" w:eastAsia="Segoe UI" w:hAnsi="Segoe UI" w:cs="Segoe UI"/>
+                <w:sz w:val="22"/>
+                <w:szCs w:val="22"/>
+              </w:rPr>
+              <w:t>important</w:t>
+            </w:r>
+            <w:r>
+              <w:rPr>
+                <w:rFonts w:ascii="Segoe UI" w:eastAsia="Segoe UI" w:hAnsi="Segoe UI" w:cs="Segoe UI"/>
+                <w:sz w:val="22"/>
+                <w:szCs w:val="22"/>
+              </w:rPr>
+              <w:t>, especially with how much there is to cover.</w:t>
             </w:r>
           </w:p>
         </w:tc>
@@ -1480,6 +1494,76 @@
             <w:shd w:val="clear" w:color="auto" w:fill="ECECEC"/>
           </w:tcPr>
           <w:p>
+            <w:r>
+              <w:rPr>
+                <w:rFonts w:ascii="Segoe UI" w:eastAsia="Segoe UI" w:hAnsi="Segoe UI" w:cs="Segoe UI"/>
+                <w:b/>
+                <w:bCs/>
+                <w:sz w:val="22"/>
+                <w:szCs w:val="22"/>
+              </w:rPr>
+              <w:t>Specific: I will begin my research into Hey Service Group, their competitors, and their target audience so I have a solid foundation before any designing starts.</w:t>
+            </w:r>
+          </w:p>
+          <w:p>
+            <w:r>
+              <w:rPr>
+                <w:rFonts w:ascii="Segoe UI" w:eastAsia="Segoe UI" w:hAnsi="Segoe UI" w:cs="Segoe UI"/>
+                <w:b/>
+                <w:bCs/>
+                <w:sz w:val="22"/>
+                <w:szCs w:val="22"/>
+              </w:rPr>
+              <w:t>Measurable: This will be done when I have documented notes on at least three competitors and a clear understanding of who the website is aimed at.</w:t>
+            </w:r>
+          </w:p>
+          <w:p>
+            <w:r>
+              <w:rPr>
+                <w:rFonts w:ascii="Segoe UI" w:eastAsia="Segoe UI" w:hAnsi="Segoe UI" w:cs="Segoe UI"/>
+                <w:b/>
+                <w:bCs/>
+                <w:sz w:val="22"/>
+                <w:szCs w:val="22"/>
+              </w:rPr>
+              <w:t xml:space="preserve">Achievable: This is a realistic first step as it only requires research </w:t>
+            </w:r>
+            <w:proofErr w:type="gramStart"/>
+            <w:r>
+              <w:rPr>
+                <w:rFonts w:ascii="Segoe UI" w:eastAsia="Segoe UI" w:hAnsi="Segoe UI" w:cs="Segoe UI"/>
+                <w:b/>
+                <w:bCs/>
+                <w:sz w:val="22"/>
+                <w:szCs w:val="22"/>
+              </w:rPr>
+              <w:t>tools</w:t>
+            </w:r>
+            <w:proofErr w:type="gramEnd"/>
+            <w:r>
+              <w:rPr>
+                <w:rFonts w:ascii="Segoe UI" w:eastAsia="Segoe UI" w:hAnsi="Segoe UI" w:cs="Segoe UI"/>
+                <w:b/>
+                <w:bCs/>
+                <w:sz w:val="22"/>
+                <w:szCs w:val="22"/>
+              </w:rPr>
+              <w:t xml:space="preserve"> I already have access to.</w:t>
+            </w:r>
+          </w:p>
+          <w:p>
+            <w:r>
+              <w:rPr>
+                <w:rFonts w:ascii="Segoe UI" w:eastAsia="Segoe UI" w:hAnsi="Segoe UI" w:cs="Segoe UI"/>
+                <w:b/>
+                <w:bCs/>
+                <w:sz w:val="22"/>
+                <w:szCs w:val="22"/>
+              </w:rPr>
+              <w:t>Relevant: This is essential to the project as I cannot design a good website without understanding the client and their audience first.</w:t>
+            </w:r>
+          </w:p>
+          <w:p>
             <w:pPr>
               <w:rPr>
                 <w:b/>
@@ -2153,296 +2237,132 @@
           <w:p>
             <w:r>
               <w:rPr>
-                <w:rFonts w:ascii="Helvetica" w:eastAsia="Helvetica" w:hAnsi="Helvetica" w:cs="Helvetica"/>
-                <w:color w:val="000000" w:themeColor="text1"/>
-                <w:sz w:val="21"/>
-                <w:szCs w:val="21"/>
-              </w:rPr>
-              <w:t xml:space="preserve">This week was all about diving deep into the research phase of the project. Since this is the very beginning of the project, I knew I </w:t>
+                <w:rFonts w:ascii="Segoe UI" w:eastAsia="Segoe UI" w:hAnsi="Segoe UI" w:cs="Segoe UI"/>
+                <w:sz w:val="22"/>
+                <w:szCs w:val="22"/>
+              </w:rPr>
+              <w:t xml:space="preserve">This week I focused on doing research for the project. I started by looking into Hey Service Group as a company — what they do, who their clients are, and what they </w:t>
             </w:r>
             <w:proofErr w:type="gramStart"/>
             <w:r>
               <w:rPr>
-                <w:rFonts w:ascii="Helvetica" w:eastAsia="Helvetica" w:hAnsi="Helvetica" w:cs="Helvetica"/>
-                <w:color w:val="000000" w:themeColor="text1"/>
-                <w:sz w:val="21"/>
-                <w:szCs w:val="21"/>
-              </w:rPr>
-              <w:t>wont</w:t>
+                <w:rFonts w:ascii="Segoe UI" w:eastAsia="Segoe UI" w:hAnsi="Segoe UI" w:cs="Segoe UI"/>
+                <w:sz w:val="22"/>
+                <w:szCs w:val="22"/>
+              </w:rPr>
+              <w:t>actually needed</w:t>
             </w:r>
             <w:proofErr w:type="gramEnd"/>
             <w:r>
               <w:rPr>
-                <w:rFonts w:ascii="Helvetica" w:eastAsia="Helvetica" w:hAnsi="Helvetica" w:cs="Helvetica"/>
-                <w:color w:val="000000" w:themeColor="text1"/>
-                <w:sz w:val="21"/>
-                <w:szCs w:val="21"/>
-              </w:rPr>
-              <w:t xml:space="preserve"> be able to jump straight into designing or try to build the website for Hey Service Group without understanding the market, understanding what the client wants </w:t>
+                <w:rFonts w:ascii="Segoe UI" w:eastAsia="Segoe UI" w:hAnsi="Segoe UI" w:cs="Segoe UI"/>
+                <w:sz w:val="22"/>
+                <w:szCs w:val="22"/>
+              </w:rPr>
+              <w:t xml:space="preserve"> from the website. I also looked at their competitors to see how similar companies present themselves online and what I could do differently or better.</w:t>
+            </w:r>
+          </w:p>
+          <w:p/>
+          <w:p>
+            <w:r>
+              <w:rPr>
+                <w:rFonts w:ascii="Segoe UI" w:eastAsia="Segoe UI" w:hAnsi="Segoe UI" w:cs="Segoe UI"/>
+                <w:sz w:val="22"/>
+                <w:szCs w:val="22"/>
+              </w:rPr>
+              <w:t>One thing I noticed straight away was that a lot of these websites had way too much text. It made them hard to read and not very user friendly. I wanted to make sure the Hey Service Group website didn't fall into that same trap, especially for the dashboard where managers need to see information quickly.</w:t>
+            </w:r>
+          </w:p>
+          <w:p/>
+          <w:p>
+            <w:r>
+              <w:rPr>
+                <w:rFonts w:ascii="Segoe UI" w:eastAsia="Segoe UI" w:hAnsi="Segoe UI" w:cs="Segoe UI"/>
+                <w:sz w:val="22"/>
+                <w:szCs w:val="22"/>
+              </w:rPr>
+              <w:t xml:space="preserve">A big part of my research this week was looking at dashboard designs. I looked at Apple dashboards and </w:t>
+            </w:r>
+            <w:proofErr w:type="spellStart"/>
+            <w:r>
+              <w:rPr>
+                <w:rFonts w:ascii="Segoe UI" w:eastAsia="Segoe UI" w:hAnsi="Segoe UI" w:cs="Segoe UI"/>
+                <w:sz w:val="22"/>
+                <w:szCs w:val="22"/>
+              </w:rPr>
+              <w:t>Dribbble</w:t>
+            </w:r>
+            <w:proofErr w:type="spellEnd"/>
+            <w:r>
+              <w:rPr>
+                <w:rFonts w:ascii="Segoe UI" w:eastAsia="Segoe UI" w:hAnsi="Segoe UI" w:cs="Segoe UI"/>
+                <w:sz w:val="22"/>
+                <w:szCs w:val="22"/>
+              </w:rPr>
+              <w:t xml:space="preserve"> to get inspiration for how to display information visually. I liked how they used images and visual elements instead of just walls of text. That's the direction I decided to go with — using visuals and simple indicators to show data so anyone can understand it </w:t>
             </w:r>
             <w:proofErr w:type="gramStart"/>
             <w:r>
               <w:rPr>
-                <w:rFonts w:ascii="Helvetica" w:eastAsia="Helvetica" w:hAnsi="Helvetica" w:cs="Helvetica"/>
-                <w:color w:val="000000" w:themeColor="text1"/>
-                <w:sz w:val="21"/>
-                <w:szCs w:val="21"/>
-              </w:rPr>
-              <w:t>and also</w:t>
+                <w:rFonts w:ascii="Segoe UI" w:eastAsia="Segoe UI" w:hAnsi="Segoe UI" w:cs="Segoe UI"/>
+                <w:sz w:val="22"/>
+                <w:szCs w:val="22"/>
+              </w:rPr>
+              <w:t>at a glance</w:t>
             </w:r>
             <w:proofErr w:type="gramEnd"/>
             <w:r>
               <w:rPr>
-                <w:rFonts w:ascii="Helvetica" w:eastAsia="Helvetica" w:hAnsi="Helvetica" w:cs="Helvetica"/>
-                <w:color w:val="000000" w:themeColor="text1"/>
-                <w:sz w:val="21"/>
-                <w:szCs w:val="21"/>
-              </w:rPr>
-              <w:t xml:space="preserve"> the dashboard system. To hit my targeted </w:t>
+                <w:rFonts w:ascii="Segoe UI" w:eastAsia="Segoe UI" w:hAnsi="Segoe UI" w:cs="Segoe UI"/>
+                <w:sz w:val="22"/>
+                <w:szCs w:val="22"/>
+              </w:rPr>
+              <w:t xml:space="preserve"> without needing to read loads of text.</w:t>
+            </w:r>
+          </w:p>
+          <w:p/>
+          <w:p>
+            <w:pPr>
+              <w:rPr>
+                <w:rFonts w:ascii="Segoe UI" w:hAnsi="Segoe UI" w:cs="Segoe UI"/>
+                <w:sz w:val="20"/>
+                <w:szCs w:val="20"/>
+              </w:rPr>
+            </w:pPr>
+            <w:r>
+              <w:rPr>
+                <w:rFonts w:ascii="Segoe UI" w:eastAsia="Segoe UI" w:hAnsi="Segoe UI" w:cs="Segoe UI"/>
+                <w:sz w:val="22"/>
+                <w:szCs w:val="22"/>
+              </w:rPr>
+              <w:t>Overall,</w:t>
+            </w:r>
+            <w:r>
+              <w:rPr>
+                <w:rFonts w:ascii="Segoe UI" w:eastAsia="Segoe UI" w:hAnsi="Segoe UI" w:cs="Segoe UI"/>
+                <w:sz w:val="22"/>
+                <w:szCs w:val="22"/>
+              </w:rPr>
+              <w:t xml:space="preserve"> this week went well. It was slow because there was nothing visual to show for it yet, but I know this research is what will make the actual design much better </w:t>
             </w:r>
             <w:proofErr w:type="gramStart"/>
             <w:r>
               <w:rPr>
-                <w:rFonts w:ascii="Helvetica" w:eastAsia="Helvetica" w:hAnsi="Helvetica" w:cs="Helvetica"/>
-                <w:color w:val="000000" w:themeColor="text1"/>
-                <w:sz w:val="21"/>
-                <w:szCs w:val="21"/>
-              </w:rPr>
-              <w:t>grades</w:t>
+                <w:rFonts w:ascii="Segoe UI" w:eastAsia="Segoe UI" w:hAnsi="Segoe UI" w:cs="Segoe UI"/>
+                <w:sz w:val="22"/>
+                <w:szCs w:val="22"/>
+              </w:rPr>
+              <w:t>later on</w:t>
             </w:r>
             <w:proofErr w:type="gramEnd"/>
             <w:r>
               <w:rPr>
-                <w:rFonts w:ascii="Helvetica" w:eastAsia="Helvetica" w:hAnsi="Helvetica" w:cs="Helvetica"/>
-                <w:color w:val="000000" w:themeColor="text1"/>
-                <w:sz w:val="21"/>
-                <w:szCs w:val="21"/>
-              </w:rPr>
-              <w:t xml:space="preserve"> I dedicated this entire week to gathering co. I spent my time looking at what already exists out there, figuring out who the target audience </w:t>
-            </w:r>
-            <w:proofErr w:type="gramStart"/>
-            <w:r>
-              <w:rPr>
-                <w:rFonts w:ascii="Helvetica" w:eastAsia="Helvetica" w:hAnsi="Helvetica" w:cs="Helvetica"/>
-                <w:color w:val="000000" w:themeColor="text1"/>
-                <w:sz w:val="21"/>
-                <w:szCs w:val="21"/>
-              </w:rPr>
-              <w:t>actually is</w:t>
-            </w:r>
-            <w:proofErr w:type="gramEnd"/>
-            <w:r>
-              <w:rPr>
-                <w:rFonts w:ascii="Helvetica" w:eastAsia="Helvetica" w:hAnsi="Helvetica" w:cs="Helvetica"/>
-                <w:color w:val="000000" w:themeColor="text1"/>
-                <w:sz w:val="21"/>
-                <w:szCs w:val="21"/>
-              </w:rPr>
-              <w:t>, and identifying the industry standards for industrial vent cleaning companies so that the platform I eventually create meets real commercial needs.</w:t>
-            </w:r>
-          </w:p>
-          <w:p>
-            <w:r>
-              <w:rPr>
-                <w:rFonts w:ascii="Helvetica" w:eastAsia="Helvetica" w:hAnsi="Helvetica" w:cs="Helvetica"/>
-                <w:color w:val="000000" w:themeColor="text1"/>
-                <w:sz w:val="21"/>
-                <w:szCs w:val="21"/>
-              </w:rPr>
-              <w:t xml:space="preserve">The main chunk of my time this week was spent conducting thorough competitor research. I looked at several existing B2B (business-to-business) websites within the industrial cleaning and maintenance sector to see how they present their services. I noticed that a lot of them can look </w:t>
-            </w:r>
-            <w:proofErr w:type="gramStart"/>
-            <w:r>
-              <w:rPr>
-                <w:rFonts w:ascii="Helvetica" w:eastAsia="Helvetica" w:hAnsi="Helvetica" w:cs="Helvetica"/>
-                <w:color w:val="000000" w:themeColor="text1"/>
-                <w:sz w:val="21"/>
-                <w:szCs w:val="21"/>
-              </w:rPr>
-              <w:t>pretty dated</w:t>
-            </w:r>
-            <w:proofErr w:type="gramEnd"/>
-            <w:r>
-              <w:rPr>
-                <w:rFonts w:ascii="Helvetica" w:eastAsia="Helvetica" w:hAnsi="Helvetica" w:cs="Helvetica"/>
-                <w:color w:val="000000" w:themeColor="text1"/>
-                <w:sz w:val="21"/>
-                <w:szCs w:val="21"/>
-              </w:rPr>
-              <w:t xml:space="preserve">, text-heavy, and difficult to navigate. This gave me a lot of clarity on what Hey Service Group needs: a clean, modern, and highly professional layout that builds instant trust. Because industrial vent cleaning deals with heavy health and safety regulations, compliance, and fire hazards, the website can't just look "cool"—it </w:t>
-            </w:r>
-            <w:proofErr w:type="gramStart"/>
-            <w:r>
-              <w:rPr>
-                <w:rFonts w:ascii="Helvetica" w:eastAsia="Helvetica" w:hAnsi="Helvetica" w:cs="Helvetica"/>
-                <w:color w:val="000000" w:themeColor="text1"/>
-                <w:sz w:val="21"/>
-                <w:szCs w:val="21"/>
-              </w:rPr>
-              <w:t>has to</w:t>
-            </w:r>
-            <w:proofErr w:type="gramEnd"/>
-            <w:r>
-              <w:rPr>
-                <w:rFonts w:ascii="Helvetica" w:eastAsia="Helvetica" w:hAnsi="Helvetica" w:cs="Helvetica"/>
-                <w:color w:val="000000" w:themeColor="text1"/>
-                <w:sz w:val="21"/>
-                <w:szCs w:val="21"/>
-              </w:rPr>
-              <w:t xml:space="preserve"> convey authority, reliability, and corporate professionalism. I made notes on how these competitor sites structured their navigation menus, how they highlighted their certifications, and how they set up their "Request a Quote" forms, which is going to be a crucial feature for our project </w:t>
-            </w:r>
-            <w:proofErr w:type="gramStart"/>
-            <w:r>
-              <w:rPr>
-                <w:rFonts w:ascii="Helvetica" w:eastAsia="Helvetica" w:hAnsi="Helvetica" w:cs="Helvetica"/>
-                <w:color w:val="000000" w:themeColor="text1"/>
-                <w:sz w:val="21"/>
-                <w:szCs w:val="21"/>
-              </w:rPr>
-              <w:t>later on</w:t>
-            </w:r>
-            <w:proofErr w:type="gramEnd"/>
-            <w:r>
-              <w:rPr>
-                <w:rFonts w:ascii="Helvetica" w:eastAsia="Helvetica" w:hAnsi="Helvetica" w:cs="Helvetica"/>
-                <w:color w:val="000000" w:themeColor="text1"/>
-                <w:sz w:val="21"/>
-                <w:szCs w:val="21"/>
+                <w:rFonts w:ascii="Segoe UI" w:eastAsia="Segoe UI" w:hAnsi="Segoe UI" w:cs="Segoe UI"/>
+                <w:sz w:val="22"/>
+                <w:szCs w:val="22"/>
               </w:rPr>
               <w:t>.</w:t>
             </w:r>
-          </w:p>
-          <w:p>
-            <w:r>
-              <w:rPr>
-                <w:rFonts w:ascii="Helvetica" w:eastAsia="Helvetica" w:hAnsi="Helvetica" w:cs="Helvetica"/>
-                <w:color w:val="000000" w:themeColor="text1"/>
-                <w:sz w:val="21"/>
-                <w:szCs w:val="21"/>
-              </w:rPr>
-              <w:t xml:space="preserve">Alongside competitor analysis, I started breaking down our specific target audience. Hey Service Group isn’t targeting regular everyday consumers; they are looking to sign contracts with commercial property managers, restaurant owners, factory supervisors, and facilities managers. This realization completely changed how I think about the project's direction. The tone of voice for the content, the imagery, and the user journey all </w:t>
-            </w:r>
-            <w:proofErr w:type="gramStart"/>
-            <w:r>
-              <w:rPr>
-                <w:rFonts w:ascii="Helvetica" w:eastAsia="Helvetica" w:hAnsi="Helvetica" w:cs="Helvetica"/>
-                <w:color w:val="000000" w:themeColor="text1"/>
-                <w:sz w:val="21"/>
-                <w:szCs w:val="21"/>
-              </w:rPr>
-              <w:t>have to</w:t>
-            </w:r>
-            <w:proofErr w:type="gramEnd"/>
-            <w:r>
-              <w:rPr>
-                <w:rFonts w:ascii="Helvetica" w:eastAsia="Helvetica" w:hAnsi="Helvetica" w:cs="Helvetica"/>
-                <w:color w:val="000000" w:themeColor="text1"/>
-                <w:sz w:val="21"/>
-                <w:szCs w:val="21"/>
-              </w:rPr>
-              <w:t xml:space="preserve"> appeal to busy professionals who just want to know if the company is qualified, fully insured, and efficient. I spent time documenting these user personas, thinking about their pain points—like the fear of failing a building safety inspection or dealing with a kitchen fire due to dirty ducts—and how our website can address those fears right on the homepage.</w:t>
-            </w:r>
-          </w:p>
-          <w:p>
-            <w:r>
-              <w:rPr>
-                <w:rFonts w:ascii="Helvetica" w:eastAsia="Helvetica" w:hAnsi="Helvetica" w:cs="Helvetica"/>
-                <w:color w:val="000000" w:themeColor="text1"/>
-                <w:sz w:val="21"/>
-                <w:szCs w:val="21"/>
-              </w:rPr>
-              <w:t xml:space="preserve">Of course, staying organized while processing all this information was a bit of a challenge. I made sure to log every single piece of research and inspiration onto my Figma brainstorming board and update my Trello cards for Week 2. It’s </w:t>
-            </w:r>
-            <w:proofErr w:type="gramStart"/>
-            <w:r>
-              <w:rPr>
-                <w:rFonts w:ascii="Helvetica" w:eastAsia="Helvetica" w:hAnsi="Helvetica" w:cs="Helvetica"/>
-                <w:color w:val="000000" w:themeColor="text1"/>
-                <w:sz w:val="21"/>
-                <w:szCs w:val="21"/>
-              </w:rPr>
-              <w:t>definitely a</w:t>
-            </w:r>
-            <w:proofErr w:type="gramEnd"/>
-            <w:r>
-              <w:rPr>
-                <w:rFonts w:ascii="Helvetica" w:eastAsia="Helvetica" w:hAnsi="Helvetica" w:cs="Helvetica"/>
-                <w:color w:val="000000" w:themeColor="text1"/>
-                <w:sz w:val="21"/>
-                <w:szCs w:val="21"/>
-              </w:rPr>
-              <w:t xml:space="preserve"> bit overwhelming trying to balance the sheer volume of industry requirements with the technical limitations of what I can realistically design and build </w:t>
-            </w:r>
-            <w:proofErr w:type="gramStart"/>
-            <w:r>
-              <w:rPr>
-                <w:rFonts w:ascii="Helvetica" w:eastAsia="Helvetica" w:hAnsi="Helvetica" w:cs="Helvetica"/>
-                <w:color w:val="000000" w:themeColor="text1"/>
-                <w:sz w:val="21"/>
-                <w:szCs w:val="21"/>
-              </w:rPr>
-              <w:t>later on</w:t>
-            </w:r>
-            <w:proofErr w:type="gramEnd"/>
-            <w:r>
-              <w:rPr>
-                <w:rFonts w:ascii="Helvetica" w:eastAsia="Helvetica" w:hAnsi="Helvetica" w:cs="Helvetica"/>
-                <w:color w:val="000000" w:themeColor="text1"/>
-                <w:sz w:val="21"/>
-                <w:szCs w:val="21"/>
-              </w:rPr>
-              <w:t xml:space="preserve">, but keeping my folders structured on Teams has stopped me from losing my mind. I am consciously trying to avoid rushing into the creative phase because I know a solid foundation right now is what will make the actual website development much smoother down the line. It’s all about </w:t>
-            </w:r>
-            <w:r>
-              <w:rPr>
-                <w:rFonts w:ascii="Helvetica" w:eastAsia="Helvetica" w:hAnsi="Helvetica" w:cs="Helvetica"/>
-                <w:color w:val="000000" w:themeColor="text1"/>
-                <w:sz w:val="21"/>
-                <w:szCs w:val="21"/>
-              </w:rPr>
-              <w:lastRenderedPageBreak/>
-              <w:t>pacing myself and proving I can follow a structured, professional project lifecycle.</w:t>
-            </w:r>
-          </w:p>
-          <w:p>
-            <w:r>
-              <w:rPr>
-                <w:rFonts w:ascii="Helvetica" w:eastAsia="Helvetica" w:hAnsi="Helvetica" w:cs="Helvetica"/>
-                <w:color w:val="000000" w:themeColor="text1"/>
-                <w:sz w:val="21"/>
-                <w:szCs w:val="21"/>
-              </w:rPr>
-              <w:t xml:space="preserve">Looking back at the week, I feel pretty good about the progress, even if it feels like things are moving slowly because there’s no visual website to show for it yet. It’s a bit intimidating realizing how intricate the commercial cleaning industry is, and sometimes I worry if I’ll be able to translate all these heavy regulatory and technical details into a seamless, user-friendly interface. However, doing this groundwork now has </w:t>
-            </w:r>
-            <w:proofErr w:type="gramStart"/>
-            <w:r>
-              <w:rPr>
-                <w:rFonts w:ascii="Helvetica" w:eastAsia="Helvetica" w:hAnsi="Helvetica" w:cs="Helvetica"/>
-                <w:color w:val="000000" w:themeColor="text1"/>
-                <w:sz w:val="21"/>
-                <w:szCs w:val="21"/>
-              </w:rPr>
-              <w:t>definitely made</w:t>
-            </w:r>
-            <w:proofErr w:type="gramEnd"/>
-            <w:r>
-              <w:rPr>
-                <w:rFonts w:ascii="Helvetica" w:eastAsia="Helvetica" w:hAnsi="Helvetica" w:cs="Helvetica"/>
-                <w:color w:val="000000" w:themeColor="text1"/>
-                <w:sz w:val="21"/>
-                <w:szCs w:val="21"/>
-              </w:rPr>
-              <w:t xml:space="preserve"> me feel more confident about the scope of the project. Next week, I plan to take all this raw research and start translating it into basic information architecture, like sitemaps and user flows, before I even touch a wireframe or a line of code. Pacing myself this week was exactly what was needed to keep the project on track for the ultimate deadline.</w:t>
-            </w:r>
-          </w:p>
-          <w:p>
-            <w:pPr>
-              <w:rPr>
-                <w:rFonts w:ascii="Segoe UI" w:hAnsi="Segoe UI" w:cs="Segoe UI"/>
-                <w:sz w:val="20"/>
-                <w:szCs w:val="20"/>
-              </w:rPr>
-            </w:pPr>
           </w:p>
         </w:tc>
         <w:tc>
@@ -5745,23 +5665,7 @@
                 <w:sz w:val="21"/>
                 <w:szCs w:val="21"/>
               </w:rPr>
-              <w:t xml:space="preserve"> I will transition from the design phase into the technical setup, creating the live website project workspace, configuring the hosting/domain settings, and setting up the global style guides (fonts, </w:t>
-            </w:r>
-            <w:r>
-              <w:rPr>
-                <w:rFonts w:ascii="Arial" w:hAnsi="Arial" w:cs="Arial"/>
-                <w:sz w:val="21"/>
-                <w:szCs w:val="21"/>
-              </w:rPr>
-              <w:t>colours</w:t>
-            </w:r>
-            <w:r>
-              <w:rPr>
-                <w:rFonts w:ascii="Arial" w:hAnsi="Arial" w:cs="Arial"/>
-                <w:sz w:val="21"/>
-                <w:szCs w:val="21"/>
-              </w:rPr>
-              <w:t>, and button styles) based on my finalized high-fidelity Figma files.</w:t>
+              <w:t xml:space="preserve"> I will transition from the design phase into the technical setup, creating the live website project workspace, configuring the hosting/domain settings, and setting up the global style guides (fonts, colours, and button styles) based on my finalized high-fidelity Figma files.</w:t>
             </w:r>
           </w:p>
           <w:p>
@@ -5792,23 +5696,7 @@
                 <w:sz w:val="21"/>
                 <w:szCs w:val="21"/>
               </w:rPr>
-              <w:t xml:space="preserve"> This target will be achieved once the blank web project is active, the typography and </w:t>
-            </w:r>
-            <w:r>
-              <w:rPr>
-                <w:rFonts w:ascii="Arial" w:hAnsi="Arial" w:cs="Arial"/>
-                <w:sz w:val="21"/>
-                <w:szCs w:val="21"/>
-              </w:rPr>
-              <w:t>colour</w:t>
-            </w:r>
-            <w:r>
-              <w:rPr>
-                <w:rFonts w:ascii="Arial" w:hAnsi="Arial" w:cs="Arial"/>
-                <w:sz w:val="21"/>
-                <w:szCs w:val="21"/>
-              </w:rPr>
-              <w:t xml:space="preserve"> variables are locked into the system settings, and the basic header and footer structures are built and visible in the browser.</w:t>
+              <w:t xml:space="preserve"> This target will be achieved once the blank web project is active, the typography and colour variables are locked into the system settings, and the basic header and footer structures are built and visible in the browser.</w:t>
             </w:r>
           </w:p>
           <w:p>
@@ -5902,23 +5790,7 @@
                 <w:sz w:val="21"/>
                 <w:szCs w:val="21"/>
               </w:rPr>
-              <w:t xml:space="preserve"> I will have the development workspace fully </w:t>
-            </w:r>
-            <w:r>
-              <w:rPr>
-                <w:rFonts w:ascii="Arial" w:hAnsi="Arial" w:cs="Arial"/>
-                <w:sz w:val="21"/>
-                <w:szCs w:val="21"/>
-              </w:rPr>
-              <w:t>prepared,</w:t>
-            </w:r>
-            <w:r>
-              <w:rPr>
-                <w:rFonts w:ascii="Arial" w:hAnsi="Arial" w:cs="Arial"/>
-                <w:sz w:val="21"/>
-                <w:szCs w:val="21"/>
-              </w:rPr>
-              <w:t xml:space="preserve"> and the global styles successfully mapped out by the end of the Week 5 session on April 3rd, 2026.</w:t>
+              <w:t xml:space="preserve"> I will have the development workspace fully prepared, and the global styles successfully mapped out by the end of the Week 5 session on April 3rd, 2026.</w:t>
             </w:r>
           </w:p>
           <w:p>
@@ -10332,23 +10204,7 @@
                 <w:szCs w:val="21"/>
               </w:rPr>
               <w:br/>
-              <w:t xml:space="preserve">A massive eye-opener for me during Session 2 was learning about Sustainable Digital Design and how heavy websites </w:t>
-            </w:r>
-            <w:r>
-              <w:rPr>
-                <w:rFonts w:ascii="Arial" w:hAnsi="Arial" w:cs="Arial"/>
-                <w:sz w:val="21"/>
-                <w:szCs w:val="21"/>
-              </w:rPr>
-              <w:t>impact</w:t>
-            </w:r>
-            <w:r>
-              <w:rPr>
-                <w:rFonts w:ascii="Arial" w:hAnsi="Arial" w:cs="Arial"/>
-                <w:sz w:val="21"/>
-                <w:szCs w:val="21"/>
-              </w:rPr>
-              <w:t xml:space="preserve"> the environment through server energy consumption. Since Hey Service Group focuses on environmental health and safety through vent cleaning, I realized it would look incredibly hypocritical if their digital platform was a massive data-hog. I identified environmental problems caused by websites—like unoptimized high-res imagery, redundant code blocks, and poorly structured animations. To implement practical, sustainable improvements, I decided to optimize my graphical elements, plan to compress all future site assets into next-gen formats like </w:t>
+              <w:t xml:space="preserve">A massive eye-opener for me during Session 2 was learning about Sustainable Digital Design and how heavy websites impact the environment through server energy consumption. Since Hey Service Group focuses on environmental health and safety through vent cleaning, I realized it would look incredibly hypocritical if their digital platform was a massive data-hog. I identified environmental problems caused by websites—like unoptimized high-res imagery, redundant code blocks, and poorly structured animations. To implement practical, sustainable improvements, I decided to optimize my graphical elements, plan to compress all future site assets into next-gen formats like </w:t>
             </w:r>
             <w:proofErr w:type="spellStart"/>
             <w:r>
@@ -11853,7 +11709,7 @@
                 <w:szCs w:val="21"/>
               </w:rPr>
               <w:br/>
-              <w:t xml:space="preserve">Once these errors were identified, I built a specific fix list and spent Session 3 applying all necessary corrections directly within the source components in Figma to lock down total structural consistency. I resized the target areas for mobile button components to make them much easier to tap on-site, adjusted text constraints to prevent mobile overflow on technical clean </w:t>
+              <w:t>Once these errors were identified, I built a specific fix list and spent Session 3 applying all necessary corrections directly within the source components in Figma to lock down total structural consistency. I resized the target areas for mobile button components to make them much easier to tap on-site, adjusted text constraints to prevent mobile overflow on technical clean reports and re-mapped the interactive prototype wires to ensure both corporate user routes—the public inspection inquiry and the private client compliance portal—navigated flawlessly without hitting dead ends. Focusing heavily on these small visual details and alignment issues dramatically strengthened the overall quality and polish of the user journey.</w:t>
             </w:r>
             <w:r>
               <w:rPr>
@@ -11861,7 +11717,8 @@
                 <w:sz w:val="21"/>
                 <w:szCs w:val="21"/>
               </w:rPr>
-              <w:t>reports and</w:t>
+              <w:br/>
+              <w:t>To wrap up this week's activities and keep my project management documentation lined up with the Distinction grading requirements, I reviewed my total weekly progress and meticulously updated my problem-solving log, Trello workflow cards, and this reflective record. Documenting how I systematically audited the prototype layout across all viewport scales provides robust evidence of rigorous quality assurance and user testing.</w:t>
             </w:r>
             <w:r>
               <w:rPr>
@@ -11869,41 +11726,8 @@
                 <w:sz w:val="21"/>
                 <w:szCs w:val="21"/>
               </w:rPr>
-              <w:t xml:space="preserve"> re-mapped the interactive prototype wires to ensure both corporate user routes—the public inspection inquiry and the private client compliance portal—navigated flawlessly without hitting dead ends. Focusing heavily on these small visual details and alignment issues dramatically strengthened the overall quality and polish of the user journey.</w:t>
-            </w:r>
-            <w:r>
-              <w:rPr>
-                <w:rFonts w:ascii="Arial" w:hAnsi="Arial" w:cs="Arial"/>
-                <w:sz w:val="21"/>
-                <w:szCs w:val="21"/>
-              </w:rPr>
               <w:br/>
-              <w:t>To wrap up this week's activities and keep my project management documentation lined up with the Distinction grading requirements, I reviewed my total weekly progress and meticulously updated my problem-solving log, Trello workflow cards, and this reflective record. Documenting how I systematically audited the prototype layout across all viewport scales provides robust evidence of rigorous quality assurance and user testing.</w:t>
-            </w:r>
-            <w:r>
-              <w:rPr>
-                <w:rFonts w:ascii="Arial" w:hAnsi="Arial" w:cs="Arial"/>
-                <w:sz w:val="21"/>
-                <w:szCs w:val="21"/>
-              </w:rPr>
-              <w:br/>
-              <w:t xml:space="preserve">Looking back at this week, catching these spacing slips and interaction errors early saved me from a massive headache down the line. It was tedious to click through the screens slowly and audit every single text wrap, but it forced me to be incredibly </w:t>
-            </w:r>
-            <w:r>
-              <w:rPr>
-                <w:rFonts w:ascii="Arial" w:hAnsi="Arial" w:cs="Arial"/>
-                <w:sz w:val="21"/>
-                <w:szCs w:val="21"/>
-              </w:rPr>
-              <w:t>detail oriented</w:t>
-            </w:r>
-            <w:r>
-              <w:rPr>
-                <w:rFonts w:ascii="Arial" w:hAnsi="Arial" w:cs="Arial"/>
-                <w:sz w:val="21"/>
-                <w:szCs w:val="21"/>
-              </w:rPr>
-              <w:t>. Next week, as we progress into Week 10, the project schedule demands that we keep pushing through the prototype production, keeping everything clear, cohesive, and perfectly aligned as we head toward final file submissions and evaluations.</w:t>
+              <w:t>Looking back at this week, catching these spacing slips and interaction errors early saved me from a massive headache down the line. It was tedious to click through the screens slowly and audit every single text wrap, but it forced me to be incredibly detail oriented. Next week, as we progress into Week 10, the project schedule demands that we keep pushing through the prototype production, keeping everything clear, cohesive, and perfectly aligned as we head toward final file submissions and evaluations.</w:t>
             </w:r>
           </w:p>
         </w:tc>
@@ -14746,23 +14570,7 @@
                 <w:szCs w:val="21"/>
               </w:rPr>
               <w:lastRenderedPageBreak/>
-              <w:t xml:space="preserve">feeling. The biggest challenge was managing the pressure of the recorded pitch and rapidly turning around their critique into functional design </w:t>
-            </w:r>
-            <w:r>
-              <w:rPr>
-                <w:rFonts w:ascii="Arial" w:hAnsi="Arial" w:cs="Arial"/>
-                <w:sz w:val="21"/>
-                <w:szCs w:val="21"/>
-              </w:rPr>
-              <w:t>adjustments but</w:t>
-            </w:r>
-            <w:r>
-              <w:rPr>
-                <w:rFonts w:ascii="Arial" w:hAnsi="Arial" w:cs="Arial"/>
-                <w:sz w:val="21"/>
-                <w:szCs w:val="21"/>
-              </w:rPr>
-              <w:t xml:space="preserve"> working through that feedback systematically is exactly what elevated the project to a professional standard. Now that all asset files are polished, tested, and perfectly organized in my submission folders, I am in a fantastic position. Moving into Week 12, I am completely ready to run my final evaluations, wrap up any outstanding administrative checks, and confidently submit this project.</w:t>
+              <w:t>feeling. The biggest challenge was managing the pressure of the recorded pitch and rapidly turning around their critique into functional design adjustments but working through that feedback systematically is exactly what elevated the project to a professional standard. Now that all asset files are polished, tested, and perfectly organized in my submission folders, I am in a fantastic position. Moving into Week 12, I am completely ready to run my final evaluations, wrap up any outstanding administrative checks, and confidently submit this project.</w:t>
             </w:r>
           </w:p>
         </w:tc>
@@ -20278,16 +20086,12 @@
 </file>
 
 <file path=customXml/item1.xml><?xml version="1.0" encoding="utf-8"?>
-<p:properties xmlns:p="http://schemas.microsoft.com/office/2006/metadata/properties" xmlns:xsi="http://www.w3.org/2001/XMLSchema-instance" xmlns:pc="http://schemas.microsoft.com/office/infopath/2007/PartnerControls">
-  <documentManagement>
-    <lcf76f155ced4ddcb4097134ff3c332f xmlns="7340dc9c-6a9a-4ed4-bb62-9ecab1d75e73">
-      <Terms xmlns="http://schemas.microsoft.com/office/infopath/2007/PartnerControls"/>
-    </lcf76f155ced4ddcb4097134ff3c332f>
-    <TaxCatchAll xmlns="fd41c268-d018-437f-814b-f93cbbf9c8b8" xsi:nil="true"/>
-    <DateAndTime xmlns="7340dc9c-6a9a-4ed4-bb62-9ecab1d75e73">2026-05-22T13:52:27+00:00</DateAndTime>
-    <numberoffiles xmlns="7340dc9c-6a9a-4ed4-bb62-9ecab1d75e73">1</numberoffiles>
-  </documentManagement>
-</p:properties>
+<?mso-contentType ?>
+<FormTemplates xmlns="http://schemas.microsoft.com/sharepoint/v3/contenttype/forms">
+  <Display>DocumentLibraryForm</Display>
+  <Edit>DocumentLibraryForm</Edit>
+  <New>DocumentLibraryForm</New>
+</FormTemplates>
 </file>
 
 <file path=customXml/item2.xml><?xml version="1.0" encoding="utf-8"?>
@@ -20519,21 +20323,22 @@
 </file>
 
 <file path=customXml/item3.xml><?xml version="1.0" encoding="utf-8"?>
-<?mso-contentType ?>
-<FormTemplates xmlns="http://schemas.microsoft.com/sharepoint/v3/contenttype/forms">
-  <Display>DocumentLibraryForm</Display>
-  <Edit>DocumentLibraryForm</Edit>
-  <New>DocumentLibraryForm</New>
-</FormTemplates>
+<p:properties xmlns:p="http://schemas.microsoft.com/office/2006/metadata/properties" xmlns:xsi="http://www.w3.org/2001/XMLSchema-instance" xmlns:pc="http://schemas.microsoft.com/office/infopath/2007/PartnerControls">
+  <documentManagement>
+    <lcf76f155ced4ddcb4097134ff3c332f xmlns="7340dc9c-6a9a-4ed4-bb62-9ecab1d75e73">
+      <Terms xmlns="http://schemas.microsoft.com/office/infopath/2007/PartnerControls"/>
+    </lcf76f155ced4ddcb4097134ff3c332f>
+    <TaxCatchAll xmlns="fd41c268-d018-437f-814b-f93cbbf9c8b8" xsi:nil="true"/>
+    <DateAndTime xmlns="7340dc9c-6a9a-4ed4-bb62-9ecab1d75e73">2026-05-22T13:52:27+00:00</DateAndTime>
+    <numberoffiles xmlns="7340dc9c-6a9a-4ed4-bb62-9ecab1d75e73">1</numberoffiles>
+  </documentManagement>
+</p:properties>
 </file>
 
 <file path=customXml/itemProps1.xml><?xml version="1.0" encoding="utf-8"?>
-<ds:datastoreItem xmlns:ds="http://schemas.openxmlformats.org/officeDocument/2006/customXml" ds:itemID="{768F69AA-A961-4689-8328-FAC943117768}">
+<ds:datastoreItem xmlns:ds="http://schemas.openxmlformats.org/officeDocument/2006/customXml" ds:itemID="{2A909951-4A86-4934-9A48-7A69EDC300AF}">
   <ds:schemaRefs>
-    <ds:schemaRef ds:uri="http://schemas.microsoft.com/office/2006/metadata/properties"/>
-    <ds:schemaRef ds:uri="http://schemas.microsoft.com/office/infopath/2007/PartnerControls"/>
-    <ds:schemaRef ds:uri="7340dc9c-6a9a-4ed4-bb62-9ecab1d75e73"/>
-    <ds:schemaRef ds:uri="fd41c268-d018-437f-814b-f93cbbf9c8b8"/>
+    <ds:schemaRef ds:uri="http://schemas.microsoft.com/sharepoint/v3/contenttype/forms"/>
   </ds:schemaRefs>
 </ds:datastoreItem>
 </file>
@@ -20558,9 +20363,12 @@
 </file>
 
 <file path=customXml/itemProps3.xml><?xml version="1.0" encoding="utf-8"?>
-<ds:datastoreItem xmlns:ds="http://schemas.openxmlformats.org/officeDocument/2006/customXml" ds:itemID="{2A909951-4A86-4934-9A48-7A69EDC300AF}">
+<ds:datastoreItem xmlns:ds="http://schemas.openxmlformats.org/officeDocument/2006/customXml" ds:itemID="{768F69AA-A961-4689-8328-FAC943117768}">
   <ds:schemaRefs>
-    <ds:schemaRef ds:uri="http://schemas.microsoft.com/sharepoint/v3/contenttype/forms"/>
+    <ds:schemaRef ds:uri="http://schemas.microsoft.com/office/2006/metadata/properties"/>
+    <ds:schemaRef ds:uri="http://schemas.microsoft.com/office/infopath/2007/PartnerControls"/>
+    <ds:schemaRef ds:uri="7340dc9c-6a9a-4ed4-bb62-9ecab1d75e73"/>
+    <ds:schemaRef ds:uri="fd41c268-d018-437f-814b-f93cbbf9c8b8"/>
   </ds:schemaRefs>
 </ds:datastoreItem>
 </file>

</xml_diff>